<commit_message>
Update Iteration 2/3 timeline to match actual current scope
Iteration 2 now includes doc updates, code fixes, GitHub setup, local
setup verification, and the presentation (previously spread across
several iterations). Iteration 3 shifted to the deferred 2-feature
work, once scoped, plus a QA pass.

Co-Authored-By: Claude Sonnet 5 <noreply@anthropic.com>
</commit_message>
<xml_diff>
--- a/docs/project-plan/Project_Plan_TreasureRow.docx
+++ b/docs/project-plan/Project_Plan_TreasureRow.docx
@@ -1712,7 +1712,7 @@
           </w:tcPr>
           <w:p>
             <w:r>
-              <w:t>Fix ownership/session bug; reliable image upload path; rotate AWS credentials</w:t>
+              <w:t>Documentation updates (Requirements, Functional Spec, Design Spec, Test Plan cross-check); code fixes (ownership bug, image upload, dead nav links, hardcoded credentials, auth_controller.py cleanup); GitHub repo set up; local copy of the app running on every team member's machine; Iteration 2 presentation</w:t>
             </w:r>
           </w:p>
         </w:tc>
@@ -1744,7 +1744,7 @@
           </w:tcPr>
           <w:p>
             <w:r>
-              <w:t>Correct .env.example and Requirements docs; update purchase/checkout diagram; auth_controller.py refactor; fix dead nav links</w:t>
+              <w:t>Requirements, design, and build-out for the 2 additional features, once the team is told what they are; QA pass on Iteration 2's fixes</w:t>
             </w:r>
           </w:p>
         </w:tc>

</xml_diff>

<commit_message>
Update Team Structure (5.1) to reflect Docs/Dev Team split; remove Pilar
- Grouped into Docs Team (Chase, Noah, Ricki, Chi) and Dev Team
  (Jonah, Cameron), matching the actual Iteration 2 assignments
- Donovan now listed as leading Testing & QA, not just PM
- Removed Pilar Cummings — no longer on the team
- Updated Revision Log entry to reflect both this change and the
  earlier timeline update

Co-Authored-By: Claude Sonnet 5 <noreply@anthropic.com>
</commit_message>
<xml_diff>
--- a/docs/project-plan/Project_Plan_TreasureRow.docx
+++ b/docs/project-plan/Project_Plan_TreasureRow.docx
@@ -1869,50 +1869,81 @@
     <w:p>
       <w:r>
         <w:rPr>
+          <w:b w:val="0"/>
           <w:i/>
           <w:color w:val="666666"/>
         </w:rPr>
-        <w:t>Proposed starting assignments, based on each person's area of focus during Iteration 1 — for the team to confirm or reassign. Roles are expected to rotate across iterations to keep the workload balanced.</w:t>
+        <w:t>Updated for Iteration 2, reflecting the Docs Team / Dev Team split and current assignments.</w:t>
       </w:r>
     </w:p>
     <w:p>
       <w:r>
-        <w:t>Donovan Griffin — Project Manager / Systems &amp; Architecture Lead (led local environment setup and the architecture review)</w:t>
+        <w:rPr>
+          <w:b w:val="0"/>
+        </w:rPr>
+        <w:t>Donovan Griffin — Project Manager; also leads Testing &amp; QA this iteration — writing test cases covering existing features plus this iteration's fixes, owning the Test Plan document, and running the QA pass once the fixes land</w:t>
       </w:r>
     </w:p>
     <w:p>
       <w:r>
-        <w:t>Pilar Cummings — QA / Test Lead (identified the ownership/session bug and the image-upload failures through hands-on testing)</w:t>
+        <w:rPr>
+          <w:b/>
+        </w:rPr>
+        <w:t>Docs Team</w:t>
       </w:r>
     </w:p>
     <w:p>
       <w:r>
-        <w:t>Noah Higgs — Security &amp; Deployment Lead (found the exposed AWS credentials and the unreachable RDS instance)</w:t>
+        <w:rPr>
+          <w:b w:val="0"/>
+        </w:rPr>
+        <w:t>Chase Jones — Requirements Lead — rewrites the Requirements Doc to match what's actually built, and documents the real database schema and environment configuration with Jonah</w:t>
       </w:r>
     </w:p>
     <w:p>
       <w:r>
-        <w:t>Chi Martin — Documentation Lead (led the documentation and setup review)</w:t>
+        <w:rPr>
+          <w:b w:val="0"/>
+        </w:rPr>
+        <w:t>Noah Higgs — Requirements (Security &amp; Deployment section) — documents the exposed credentials, hardcoded secret key, and hardcoded admin login as findings with planned fixes</w:t>
       </w:r>
     </w:p>
     <w:p>
       <w:r>
-        <w:t>Ricki Davis — Comparative Analysis Lead (produced the detailed CloudMart code-versus-docs comparison)</w:t>
+        <w:rPr>
+          <w:b w:val="0"/>
+        </w:rPr>
+        <w:t>Ricki Davis — Functional Specification Lead — documents how each existing feature actually behaves step by step</w:t>
       </w:r>
     </w:p>
     <w:p>
       <w:r>
-        <w:t>Jonah Goodwine — Database &amp; Application Support Lead</w:t>
+        <w:rPr>
+          <w:b w:val="0"/>
+        </w:rPr>
+        <w:t>Chi Martin — Design Specification Lead — contributed the corrected purchase/checkout flow diagram, now part of the team's combined Functional Specification document</w:t>
       </w:r>
     </w:p>
     <w:p>
       <w:r>
-        <w:t>Chase Jones — Backend / Setup Lead (diagnosed authorization gaps while getting CloudMart running)</w:t>
+        <w:rPr>
+          <w:b/>
+        </w:rPr>
+        <w:t>Dev Team</w:t>
       </w:r>
     </w:p>
     <w:p>
       <w:r>
-        <w:t>Cameron Ridgley — Role to be confirmed by the team</w:t>
+        <w:rPr>
+          <w:b w:val="0"/>
+        </w:rPr>
+        <w:t>Jonah Goodwine — Co-PM; database schema, credential rotation, secret key/admin login replacement, auth_controller.py cleanup; meeting minutes &amp; time log</w:t>
+      </w:r>
+    </w:p>
+    <w:p>
+      <w:pPr/>
+      <w:r>
+        <w:t>Cameron Ridgley — Jira board owner; dead nav link fixes; Design Spec support</w:t>
       </w:r>
     </w:p>
     <w:p>
@@ -2049,6 +2080,38 @@
           <w:p>
             <w:r>
               <w:t>Initial project plan drafted from the team's Iteration 1 evaluation findings.</w:t>
+            </w:r>
+          </w:p>
+        </w:tc>
+      </w:tr>
+      <w:tr>
+        <w:tc>
+          <w:tcPr>
+            <w:tcW w:type="dxa" w:w="2880"/>
+          </w:tcPr>
+          <w:p>
+            <w:r>
+              <w:t>2</w:t>
+            </w:r>
+          </w:p>
+        </w:tc>
+        <w:tc>
+          <w:tcPr>
+            <w:tcW w:type="dxa" w:w="2880"/>
+          </w:tcPr>
+          <w:p>
+            <w:r>
+              <w:t>October 1, 2026</w:t>
+            </w:r>
+          </w:p>
+        </w:tc>
+        <w:tc>
+          <w:tcPr>
+            <w:tcW w:type="dxa" w:w="2880"/>
+          </w:tcPr>
+          <w:p>
+            <w:r>
+              <w:t>Updated the Iteration 2/3 timeline to match actual scope (documentation updates, code fixes, GitHub setup, and local setup verification landed in Iteration 2; deferred feature work and a QA pass moved to Iteration 3). Updated Team Structure to reflect the Docs Team / Dev Team split and Donovan taking over Testing &amp; QA; removed Pilar Cummings, no longer on the team.</w:t>
             </w:r>
           </w:p>
         </w:tc>

</xml_diff>

<commit_message>
Remove image upload fix from Project Plan scope — not being worked on now
Removed from: the Iteration 2 'done' definition, Major Software
Functions (Planned list), Performance/Behavior Issues, the Risk
Table, the Project Task Set, and the Iteration 2 timeline
deliverables.

Co-Authored-By: Claude Sonnet 5 <noreply@anthropic.com>
</commit_message>
<xml_diff>
--- a/docs/project-plan/Project_Plan_TreasureRow.docx
+++ b/docs/project-plan/Project_Plan_TreasureRow.docx
@@ -668,7 +668,7 @@
     </w:p>
     <w:p>
       <w:r>
-        <w:t>For this semester, “done” means: the account and session bug that lets one logged-in user see and act on another account's storefront and listings is fixed and verified; image upload and display work reliably without depending entirely on a live AWS S3 connection, or fail gracefully with a clear message instead of a broken-image icon; the exposed AWS RDS credentials are rotated and removed from version control, and the hardcoded Flask secret key and hardcoded admin login are replaced with real values; the .env.example file matches what the code actually reads; the purchase/checkout functional flow diagram reflects the application's real behavior; and the application is stable enough to demo end-to-end at the final iteration.</w:t>
+        <w:t>For this semester, “done” means: the account and session bug that lets one logged-in user see and act on another account's storefront and listings is fixed and verified; the exposed AWS RDS credentials are rotated and removed from version control, and the hardcoded Flask secret key and hardcoded admin login are replaced with real values; the .env.example file matches what the code actually reads; the purchase/checkout functional flow diagram reflects the application's real behavior; and the application is stable enough to demo end-to-end at the final iteration.</w:t>
       </w:r>
     </w:p>
     <w:p>
@@ -775,14 +775,6 @@
         <w:pStyle w:val="ListBullet"/>
       </w:pPr>
       <w:r>
-        <w:t>Planned: Deliver reliable image upload/display without a hard dependency on live AWS S3</w:t>
-      </w:r>
-    </w:p>
-    <w:p>
-      <w:pPr>
-        <w:pStyle w:val="ListBullet"/>
-      </w:pPr>
-      <w:r>
         <w:t>Planned: Rotate exposed AWS credentials and remove plaintext secrets from version control</w:t>
       </w:r>
     </w:p>
@@ -835,14 +827,6 @@
         <w:t>1.3 Performance/Behavior Issues</w:t>
       </w:r>
       <w:bookmarkEnd w:id="4"/>
-    </w:p>
-    <w:p>
-      <w:pPr>
-        <w:pStyle w:val="ListBullet"/>
-      </w:pPr>
-      <w:r>
-        <w:t>Every image upload (listing photo, storefront logo) depends entirely on a live AWS S3 connection; there is no fallback, so a listing cannot be created at all without one, and a failed upload shows as a broken image icon rather than a clear error</w:t>
-      </w:r>
     </w:p>
     <w:p>
       <w:pPr>
@@ -1239,38 +1223,6 @@
           </w:tcPr>
           <w:p>
             <w:r>
-              <w:t>Image upload/display broken without a live S3 connection</w:t>
-            </w:r>
-          </w:p>
-        </w:tc>
-        <w:tc>
-          <w:tcPr>
-            <w:tcW w:type="dxa" w:w="2160"/>
-          </w:tcPr>
-          <w:p>
-            <w:r>
-              <w:t>Already occurring</w:t>
-            </w:r>
-          </w:p>
-        </w:tc>
-        <w:tc>
-          <w:tcPr>
-            <w:tcW w:type="dxa" w:w="1728"/>
-          </w:tcPr>
-          <w:p>
-            <w:r>
-              <w:t>High</w:t>
-            </w:r>
-          </w:p>
-        </w:tc>
-      </w:tr>
-      <w:tr>
-        <w:tc>
-          <w:tcPr>
-            <w:tcW w:type="dxa" w:w="5184"/>
-          </w:tcPr>
-          <w:p>
-            <w:r>
               <w:t>Listing/storefront ownership bug going unresolved</w:t>
             </w:r>
           </w:p>
@@ -1498,14 +1450,6 @@
         <w:pStyle w:val="ListBullet"/>
       </w:pPr>
       <w:r>
-        <w:t>Deliver reliable image upload/display (local fallback, or a documented, graceful failure state)</w:t>
-      </w:r>
-    </w:p>
-    <w:p>
-      <w:pPr>
-        <w:pStyle w:val="ListBullet"/>
-      </w:pPr>
-      <w:r>
         <w:t>Rotate and secure AWS credentials; remove plaintext secrets from version control</w:t>
       </w:r>
     </w:p>
@@ -1688,7 +1632,7 @@
       <w:tr>
         <w:tc>
           <w:tcPr>
-            <w:tcW w:type="dxa" w:w="1584"/>
+            <w:tcW w:type="dxa" w:w="2880"/>
           </w:tcPr>
           <w:p>
             <w:r>
@@ -1698,7 +1642,7 @@
         </w:tc>
         <w:tc>
           <w:tcPr>
-            <w:tcW w:type="dxa" w:w="1872"/>
+            <w:tcW w:type="dxa" w:w="2880"/>
           </w:tcPr>
           <w:p>
             <w:r>
@@ -1708,11 +1652,11 @@
         </w:tc>
         <w:tc>
           <w:tcPr>
-            <w:tcW w:type="dxa" w:w="5760"/>
+            <w:tcW w:type="dxa" w:w="2880"/>
           </w:tcPr>
           <w:p>
             <w:r>
-              <w:t>Documentation updates (Requirements, Functional Spec, Design Spec, Test Plan cross-check); code fixes (ownership bug, image upload, dead nav links, hardcoded credentials, auth_controller.py cleanup); GitHub repo set up; local copy of the app running on every team member's machine; Iteration 2 presentation</w:t>
+              <w:t>Documentation updates (Requirements, Functional Spec, Design Spec, Test Plan cross-check); code fixes (ownership bug, dead nav links, hardcoded credentials, auth_controller.py cleanup); GitHub repo set up; local copy of the app running on every team member's machine; Iteration 2 presentation</w:t>
             </w:r>
           </w:p>
         </w:tc>
@@ -2116,6 +2060,38 @@
           </w:p>
         </w:tc>
       </w:tr>
+      <w:tr>
+        <w:tc>
+          <w:tcPr>
+            <w:tcW w:type="dxa" w:w="2880"/>
+          </w:tcPr>
+          <w:p>
+            <w:r>
+              <w:t>2</w:t>
+            </w:r>
+          </w:p>
+        </w:tc>
+        <w:tc>
+          <w:tcPr>
+            <w:tcW w:type="dxa" w:w="2880"/>
+          </w:tcPr>
+          <w:p>
+            <w:r>
+              <w:t>October 1, 2026</w:t>
+            </w:r>
+          </w:p>
+        </w:tc>
+        <w:tc>
+          <w:tcPr>
+            <w:tcW w:type="dxa" w:w="2880"/>
+          </w:tcPr>
+          <w:p>
+            <w:r>
+              <w:t>Removed the image upload/display fix from scope this iteration — not being worked on right now. Pulled it from the 'done' definition, the major software functions list, performance issues, the risk table, the project task set, and the Iteration 2 timeline deliverables.</w:t>
+            </w:r>
+          </w:p>
+        </w:tc>
+      </w:tr>
     </w:tbl>
     <w:sectPr>
       <w:pgSz w:w="12240" w:h="15840"/>

</xml_diff>

<commit_message>
Fix dead storefront nav links, add About/Sitemap pages, remove debug console.log; update Project Plan for Iteration 3
</commit_message>
<xml_diff>
--- a/docs/project-plan/Project_Plan_TreasureRow.docx
+++ b/docs/project-plan/Project_Plan_TreasureRow.docx
@@ -23,7 +23,7 @@
           <w:b/>
           <w:sz w:val="24"/>
         </w:rPr>
-        <w:t>Donovan Griffin, Jonah Goodwine, Cameron Ridgley, Chase Jones, Ricki Davis, Pilar Cummings, Chi Martin, Noah Higgs</w:t>
+        <w:t>Donovan Griffin, Jonah Goodwine, Cameron Ridgley, Chase Jones, Ricki Davis, Chi Martin, Noah Higgs</w:t>
       </w:r>
     </w:p>
     <w:p>
@@ -668,7 +668,12 @@
     </w:p>
     <w:p>
       <w:r>
-        <w:t>For this semester, “done” means: the account and session bug that lets one logged-in user see and act on another account's storefront and listings is fixed and verified; the exposed AWS RDS credentials are rotated and removed from version control, and the hardcoded Flask secret key and hardcoded admin login are replaced with real values; the .env.example file matches what the code actually reads; the purchase/checkout functional flow diagram reflects the application's real behavior; and the application is stable enough to demo end-to-end at the final iteration.</w:t>
+        <w:t>For this semester, “done” means: the account and session bug that lets one logged-in user see and act on another account's storefront and listings is fixed and verified, with tests covering account switching and direct API requests; the exposed AWS RDS credentials are rotated and removed from version control, with any credential that was ever exposed treated as compromised; the hardcoded Flask secret key and hardcoded admin login are replaced with real values loaded from environment configuration; the .env.example file matches what the code actually reads; the purchase/checkout functional flow diagram reflects the application's real behavior; the new token-based checkout feature has a clearly defined scope before it's considered built; and the application is deployed and stable enough to demo end-to-end at the final iteration.</w:t>
+      </w:r>
+    </w:p>
+    <w:p>
+      <w:r>
+        <w:t>Before building the token-based checkout feature, the team needs to agree on what “token” means here — an internal order/checkout token, not a real payment-processor integration — and define how it's issued, validated, and tested.</w:t>
       </w:r>
     </w:p>
     <w:p>
@@ -819,6 +824,14 @@
       </w:r>
     </w:p>
     <w:p>
+      <w:pPr>
+        <w:pStyle w:val="ListBullet"/>
+      </w:pPr>
+      <w:r>
+        <w:t>Planned: Build a token-based system for handling funds during checkout — an internal checkout token, not a real payment processor integration — including how it's issued, validated, and tested</w:t>
+      </w:r>
+    </w:p>
+    <w:p>
       <w:bookmarkStart w:id="4" w:name="toc_1_3"/>
       <w:pPr>
         <w:pStyle w:val="Heading2"/>
@@ -833,7 +846,7 @@
         <w:pStyle w:val="ListBullet"/>
       </w:pPr>
       <w:r>
-        <w:t>The account/session layer does not reliably isolate which account is “current” — testing with multiple accounts in one browser showed one account able to see and delete another account's storefront and listings, even though the same ownership check correctly blocks this when identity is passed directly to the API</w:t>
+        <w:t>The account/session layer does not reliably isolate which account is “current” — testing with multiple accounts in one browser showed one account able to see and delete another account's storefront and listings, even though the same ownership check correctly blocks this when identity is passed directly to the API; acceptance for this fix requires automated tests covering account switching, direct API requests, and unauthorized access attempts</w:t>
       </w:r>
     </w:p>
     <w:p>
@@ -849,7 +862,7 @@
         <w:pStyle w:val="ListBullet"/>
       </w:pPr>
       <w:r>
-        <w:t>A production AWS RDS hostname, username, and password are committed in plaintext in .ebextensions/env.config</w:t>
+        <w:t>A production AWS RDS hostname, username, and password are committed in plaintext in .ebextensions/env.config (already redacted to CHANGE_ME placeholders in the current repo, loaded from environment configuration instead; any credential that was ever exposed is treated as compromised and rotated)</w:t>
       </w:r>
     </w:p>
     <w:p>
@@ -889,7 +902,7 @@
         <w:pStyle w:val="ListBullet"/>
       </w:pPr>
       <w:r>
-        <w:t>The purchase/checkout functional flow diagram doesn't reflect the application's actual behavior and has no explanatory text</w:t>
+        <w:t>The purchase/checkout functional flow diagram doesn't reflect the application's actual behavior and has no explanatory text; the corrected diagram should show actors, major requests, and success/failure outcomes</w:t>
       </w:r>
     </w:p>
     <w:p>
@@ -1065,7 +1078,7 @@
     </w:p>
     <w:p>
       <w:r>
-        <w:t>Estimates are based on the workload the team observed while reading, setting up, and independently testing the codebase during Iteration 1 — including the setup troubleshooting required to get a local copy of the application running, and the time spent verifying each core feature end to end.</w:t>
+        <w:t>Estimates are based on the workload the team observed while reading, setting up, and independently testing the codebase during Iteration 1 — including the setup troubleshooting required to get a local copy of the application running, and the time spent verifying each core feature end to end. As the team takes on Iteration 3 work — full AWS deployment, the token-based checkout feature, and the AI-assisted documentation review — these estimates should be revisited against actual effort spent.</w:t>
       </w:r>
     </w:p>
     <w:p>
@@ -1080,7 +1093,7 @@
     </w:p>
     <w:p>
       <w:r>
-        <w:t>People: Donovan Griffin, Jonah Goodwine, Cameron Ridgley, Chase Jones, Ricki Davis, Pilar Cummings, Chi Martin, Noah Higgs</w:t>
+        <w:t>People: Donovan Griffin, Jonah Goodwine, Cameron Ridgley, Chase Jones, Ricki Davis, Chi Martin, Noah Higgs</w:t>
       </w:r>
     </w:p>
     <w:p>
@@ -1115,7 +1128,7 @@
     </w:p>
     <w:p>
       <w:r>
-        <w:t>The risks below are carried forward from what the team's Iteration 1 software evaluation surfaced, rather than hypothetical concerns — most are issues already confirmed in the running application.</w:t>
+        <w:t>The risks below are carried forward from what the team's Iteration 1 software evaluation surfaced, rather than hypothetical concerns — most are issues already confirmed in the running application. Likelihood and impact are reviewed at each iteration checkpoint; “Already occurring” means the issue was confirmed active at the time it was found, not just a probability estimate.</w:t>
       </w:r>
     </w:p>
     <w:p>
@@ -1191,7 +1204,7 @@
           </w:tcPr>
           <w:p>
             <w:r>
-              <w:t>AWS costs or account status preventing the team from restoring the original cloud deployment</w:t>
+              <w:t>AWS costs or account status preventing the team from restoring the original cloud deployment. Mitigation: confirm current AWS account status and access, set a spending cap, and restore or provision RDS before full deployment. Owner: Donovan.</w:t>
             </w:r>
           </w:p>
         </w:tc>
@@ -1223,7 +1236,7 @@
           </w:tcPr>
           <w:p>
             <w:r>
-              <w:t>Listing/storefront ownership bug going unresolved</w:t>
+              <w:t>Listing/storefront ownership bug. Status: fixed in Iteration 2 — the server is now the only source of identity, with 19 regression tests added. Residual risk is a regression if tests are skipped. Owner: Cameron.</w:t>
             </w:r>
           </w:p>
         </w:tc>
@@ -1233,7 +1246,7 @@
           </w:tcPr>
           <w:p>
             <w:r>
-              <w:t>Already occurring</w:t>
+              <w:t>Low (post-fix)</w:t>
             </w:r>
           </w:p>
         </w:tc>
@@ -1243,7 +1256,7 @@
           </w:tcPr>
           <w:p>
             <w:r>
-              <w:t>High</w:t>
+              <w:t>High (if it recurred)</w:t>
             </w:r>
           </w:p>
         </w:tc>
@@ -1255,7 +1268,7 @@
           </w:tcPr>
           <w:p>
             <w:r>
-              <w:t>Exposed AWS credentials remaining in version control</w:t>
+              <w:t>Exposed AWS credentials in version control. Status: redacted in the current repo and loaded from .env; any credential that was ever exposed is treated as compromised and rotated. Owner: Jonah, Noah.</w:t>
             </w:r>
           </w:p>
         </w:tc>
@@ -1265,7 +1278,7 @@
           </w:tcPr>
           <w:p>
             <w:r>
-              <w:t>Already occurring</w:t>
+              <w:t>Low (post-fix)</w:t>
             </w:r>
           </w:p>
         </w:tc>
@@ -1275,7 +1288,7 @@
           </w:tcPr>
           <w:p>
             <w:r>
-              <w:t>High</w:t>
+              <w:t>High (if it recurred)</w:t>
             </w:r>
           </w:p>
         </w:tc>
@@ -1287,7 +1300,7 @@
           </w:tcPr>
           <w:p>
             <w:r>
-              <w:t>Requirements and diagram documentation drifting further from the codebase</w:t>
+              <w:t>Requirements and diagram documentation drifting further from the codebase. Mitigation: cross-check docs against the code each iteration before submission. Owner: Chase, Chi.</w:t>
             </w:r>
           </w:p>
         </w:tc>
@@ -1319,7 +1332,7 @@
           </w:tcPr>
           <w:p>
             <w:r>
-              <w:t>Team member availability</w:t>
+              <w:t>Team member availability. Mitigation: track workload and blockers at each iteration checkpoint. Owner: Donovan.</w:t>
             </w:r>
           </w:p>
         </w:tc>
@@ -1351,7 +1364,7 @@
           </w:tcPr>
           <w:p>
             <w:r>
-              <w:t>Frontend/backend technical debt (inline SQL, dead links)</w:t>
+              <w:t>Frontend/backend technical debt (inline SQL, dead links). Mitigation: prioritize fixes by user impact; refactor auth_controller.py; fix dead nav links. Owner: Jonah, Cameron.</w:t>
             </w:r>
           </w:p>
         </w:tc>
@@ -1383,7 +1396,7 @@
           </w:tcPr>
           <w:p>
             <w:r>
-              <w:t>Course workload</w:t>
+              <w:t>Course workload. Mitigation: review remaining effort weekly and escalate scope concerns early. Owner: Donovan.</w:t>
             </w:r>
           </w:p>
         </w:tc>
@@ -1491,6 +1504,38 @@
       </w:pPr>
       <w:r>
         <w:t>Update the purchase/checkout functional flow diagram</w:t>
+      </w:r>
+    </w:p>
+    <w:p>
+      <w:pPr>
+        <w:pStyle w:val="ListBullet"/>
+      </w:pPr>
+      <w:r>
+        <w:t>Complete full AWS deployment to Elastic Beanstalk with a live RDS database</w:t>
+      </w:r>
+    </w:p>
+    <w:p>
+      <w:pPr>
+        <w:pStyle w:val="ListBullet"/>
+      </w:pPr>
+      <w:r>
+        <w:t>Build and document a token-based system for handling funds during checkout</w:t>
+      </w:r>
+    </w:p>
+    <w:p>
+      <w:pPr>
+        <w:pStyle w:val="ListBullet"/>
+      </w:pPr>
+      <w:r>
+        <w:t>Implement the fixes committed to in the team's Risk Assessment Plan; update that document to reflect real status</w:t>
+      </w:r>
+    </w:p>
+    <w:p>
+      <w:pPr>
+        <w:pStyle w:val="ListBullet"/>
+      </w:pPr>
+      <w:r>
+        <w:t>Run an AI-assisted polish pass on every project document using one team-wide AI tool, recording before/after versions and prompts used</w:t>
       </w:r>
     </w:p>
     <w:p>
@@ -1624,7 +1669,7 @@
           </w:tcPr>
           <w:p>
             <w:r>
-              <w:t>Evaluation Doc, Presentation, Minutes, Time Log, Project Plan</w:t>
+              <w:t>Evaluation Doc, Presentation, Minutes, Time Log, Project Plan Status: Complete.</w:t>
             </w:r>
           </w:p>
         </w:tc>
@@ -1656,7 +1701,7 @@
           </w:tcPr>
           <w:p>
             <w:r>
-              <w:t>Documentation updates (Requirements, Functional Spec, Design Spec, Test Plan cross-check); code fixes (ownership bug, dead nav links, hardcoded credentials, auth_controller.py cleanup); GitHub repo set up; local copy of the app running on every team member's machine; Iteration 2 presentation</w:t>
+              <w:t>Documentation updates (Requirements, Functional Spec, Design Spec, Test Plan cross-check); code fixes (ownership bug, dead nav links, hardcoded credentials, auth_controller.py cleanup); GitHub repo set up; local copy of the app running on every team member's machine; Iteration 2 presentation Status: Complete.</w:t>
             </w:r>
           </w:p>
         </w:tc>
@@ -1678,7 +1723,7 @@
           </w:tcPr>
           <w:p>
             <w:r>
-              <w:t>Oct 22, 2026</w:t>
+              <w:t>Oct 27, 2026 (Extended)</w:t>
             </w:r>
           </w:p>
         </w:tc>
@@ -1688,7 +1733,7 @@
           </w:tcPr>
           <w:p>
             <w:r>
-              <w:t>Requirements, design, and build-out for the 2 additional features, once the team is told what they are; QA pass on Iteration 2's fixes</w:t>
+              <w:t>All current code fixed; full AWS deployment to Elastic Beanstalk with a live RDS database; a new token-based payment system built and documented; the team's Risk Assessment Plan fixes implemented and that document updated to reflect real status; an AI-assisted polish pass applied to every project document using one team-wide tool, with before/after versions and prompts recorded; minor Functional Spec and Design Spec updates reflecting implementation; meeting minutes, time log, and a status statement on what's working and what isn't. Status: In progress.</w:t>
             </w:r>
           </w:p>
         </w:tc>
@@ -1720,7 +1765,7 @@
           </w:tcPr>
           <w:p>
             <w:r>
-              <w:t>Testing/QA pass; deployment verification</w:t>
+              <w:t>Testing/QA pass; deployment verification Status: Not started.</w:t>
             </w:r>
           </w:p>
         </w:tc>
@@ -1752,7 +1797,7 @@
           </w:tcPr>
           <w:p>
             <w:r>
-              <w:t>Remaining bug fixes and polish from earlier iterations; prep for final testing</w:t>
+              <w:t>Remaining bug fixes and polish from earlier iterations; prep for final testing Status: Not started.</w:t>
             </w:r>
           </w:p>
         </w:tc>
@@ -1784,7 +1829,7 @@
           </w:tcPr>
           <w:p>
             <w:r>
-              <w:t>Final testing / regression pass, final documentation cleanup, and the final demo / presentation</w:t>
+              <w:t>Final testing / regression pass, final documentation cleanup, and the final demo / presentation Status: Not started — date pending instructor confirmation.</w:t>
             </w:r>
           </w:p>
         </w:tc>
@@ -1825,7 +1870,7 @@
         <w:rPr>
           <w:b w:val="0"/>
         </w:rPr>
-        <w:t>Donovan Griffin — Project Manager; also leads Testing &amp; QA this iteration — writing test cases covering existing features plus this iteration's fixes, owning the Test Plan document, and running the QA pass once the fixes land</w:t>
+        <w:t>Donovan Griffin — Project Manager; leads Testing &amp; QA this iteration — writing test cases covering existing features plus this iteration's fixes, owning the Test Plan document, and running the QA pass once the fixes land; also contributes directly to development work, including the AWS RDS security group fix, the Elastic Beanstalk deployment, and the payment token system (with Jonah)</w:t>
       </w:r>
     </w:p>
     <w:p>
@@ -1927,7 +1972,7 @@
     </w:p>
     <w:p>
       <w:r>
-        <w:t>Changes must be reviewed by at least one other team member before being merged. Any new or changed feature must include updated test evidence — screenshots and pass/fail notes — added to the Test Plan before it's considered complete.</w:t>
+        <w:t>Changes must be reviewed by at least one other team member before being merged. Any new or changed feature must include updated test evidence — screenshots and pass/fail notes — added to the Test Plan before it's considered complete. A task counts as complete once it's merged, meets its acceptance criteria, and has recorded test evidence — not just a changed line of code. Regression tests should cover account isolation, authentication, listing/storefront ownership, cart and checkout, wishlist, and returns before any release candidate is demoed.</w:t>
       </w:r>
     </w:p>
     <w:p>
@@ -2088,6 +2133,70 @@
           <w:p>
             <w:r>
               <w:t>Removed the image upload/display fix from scope this iteration — not being worked on right now. Pulled it from the 'done' definition, the major software functions list, performance issues, the risk table, the project task set, and the Iteration 2 timeline deliverables.</w:t>
+            </w:r>
+          </w:p>
+        </w:tc>
+      </w:tr>
+      <w:tr>
+        <w:tc>
+          <w:tcPr>
+            <w:tcW w:type="dxa" w:w="2880"/>
+          </w:tcPr>
+          <w:p>
+            <w:r>
+              <w:t>3</w:t>
+            </w:r>
+          </w:p>
+        </w:tc>
+        <w:tc>
+          <w:tcPr>
+            <w:tcW w:type="dxa" w:w="2880"/>
+          </w:tcPr>
+          <w:p>
+            <w:r>
+              <w:t>October 14, 2026</w:t>
+            </w:r>
+          </w:p>
+        </w:tc>
+        <w:tc>
+          <w:tcPr>
+            <w:tcW w:type="dxa" w:w="2880"/>
+          </w:tcPr>
+          <w:p>
+            <w:r>
+              <w:t>Updated the Iteration 3 timeline entry and project task set to match the actual assignment requirements: full AWS deployment, all current code fixed, a new token-based payment system, implementation of the team's Risk Assessment Plan with the document updated to reflect real status, and a team-wide AI-assisted document polish pass with before/after versions and prompts recorded. Replaced the placeholder '2 additional features, once the team is told what they are' language, which is no longer accurate.</w:t>
+            </w:r>
+          </w:p>
+        </w:tc>
+      </w:tr>
+      <w:tr>
+        <w:tc>
+          <w:tcPr>
+            <w:tcW w:type="dxa" w:w="2880"/>
+          </w:tcPr>
+          <w:p>
+            <w:r>
+              <w:t>3</w:t>
+            </w:r>
+          </w:p>
+        </w:tc>
+        <w:tc>
+          <w:tcPr>
+            <w:tcW w:type="dxa" w:w="2880"/>
+          </w:tcPr>
+          <w:p>
+            <w:r>
+              <w:t>October 16, 2026</w:t>
+            </w:r>
+          </w:p>
+        </w:tc>
+        <w:tc>
+          <w:tcPr>
+            <w:tcW w:type="dxa" w:w="2880"/>
+          </w:tcPr>
+          <w:p>
+            <w:r>
+              <w:t>Merged reviewed AI-assisted suggestions (from the team's AI document polish pass) into the working Project Plan: added acceptance criteria for existing planned fixes, expanded the Risk Table with mitigation and owner for each risk and updated status for the two risks already resolved (ownership bug, exposed credentials), added a status note to each Timeline Chart row, flagged a scope decision needed for the token-based checkout feature, and added a definition of “complete” plus expanded regression test coverage to the QA section. Kept the team's own voice rather than the AI's more formal phrasing; see Project_Plan_BEFORE_TreasureRow.docx and Project_Plan_TreasureRow_AFTER.docx for the full before/after AI evidence.</w:t>
             </w:r>
           </w:p>
         </w:tc>

</xml_diff>

<commit_message>
SCRUM-61: security docs, risk table update, presenter name comments
Co-Authored-By: Claude Sonnet 5.5 <noreply@anthropic.com>
</commit_message>
<xml_diff>
--- a/docs/project-plan/Project_Plan_TreasureRow.docx
+++ b/docs/project-plan/Project_Plan_TreasureRow.docx
@@ -1268,7 +1268,7 @@
           </w:tcPr>
           <w:p>
             <w:r>
-              <w:t>Exposed AWS credentials in version control. Status: redacted in the current repo and loaded from .env; any credential that was ever exposed is treated as compromised and rotated. Owner: Jonah, Noah.</w:t>
+              <w:t xml:space="preserve">Exposed AWS credentials in version control. Status: resolved. The exposed credentials were removed from version control and replaced with new credentials issued by Jonah Goodwine, which are entered only in each member’s local .env file and the Elastic Beanstalk environment configuration. Residual risk: a credential being committed again, so any that is ever committed or written into a document is rotated. Owner: Jonah, Noah.</w:t>
             </w:r>
           </w:p>
         </w:tc>
@@ -2201,6 +2201,38 @@
           </w:p>
         </w:tc>
       </w:tr>
+      <w:tr>
+        <w:tc>
+          <w:tcPr>
+            <w:tcW w:type="dxa" w:w="2880"/>
+          </w:tcPr>
+          <w:p>
+            <w:r>
+              <w:t xml:space="preserve">3</w:t>
+            </w:r>
+          </w:p>
+        </w:tc>
+        <w:tc>
+          <w:tcPr>
+            <w:tcW w:type="dxa" w:w="2880"/>
+          </w:tcPr>
+          <w:p>
+            <w:r>
+              <w:t xml:space="preserve">October 27, 2026</w:t>
+            </w:r>
+          </w:p>
+        </w:tc>
+        <w:tc>
+          <w:tcPr>
+            <w:tcW w:type="dxa" w:w="2880"/>
+          </w:tcPr>
+          <w:p>
+            <w:r>
+              <w:t xml:space="preserve">Updated the Risk Table’s exposed-credentials row to resolved: credentials were removed from version control and replaced with new ones issued by Jonah Goodwine, now held only in .env and the Elastic Beanstalk configuration. The Requirements document’s Security section (6.4) was updated to match the live AWS deployment.</w:t>
+            </w:r>
+          </w:p>
+        </w:tc>
+      </w:tr>
     </w:tbl>
     <w:sectPr>
       <w:pgSz w:w="12240" w:h="15840"/>

</xml_diff>

<commit_message>
Project Plan: add the team's Iteration 3 work
- Jonah: Elastic Beanstalk deployment (live site), buyer/seller messaging
  (back in scope), AWS runbook, nginx upload limit
- Noah: exposed-credentials risk resolved with new credentials (SCRUM-61);
  SCRUM-61 security hardening listed as in progress
- RDS security group fix (campus range, verified 10/27) with a new access
  risk row; AWS cost risk updated, billing alarm in progress
- Test count corrected to 95; Iteration 3 timeline status updated

Co-Authored-By: Claude Opus 5.5 <noreply@anthropic.com>
</commit_message>
<xml_diff>
--- a/docs/project-plan/Project_Plan_TreasureRow.docx
+++ b/docs/project-plan/Project_Plan_TreasureRow.docx
@@ -194,7 +194,7 @@
         <w:r>
           <w:t>2.2 Project Resources</w:t>
           <w:tab/>
-          <w:t>5</w:t>
+          <w:t>6</w:t>
         </w:r>
       </w:hyperlink>
     </w:p>
@@ -347,7 +347,7 @@
         <w:r>
           <w:t>5.2 Management Reporting and Communication</w:t>
           <w:tab/>
-          <w:t>9</w:t>
+          <w:t>10</w:t>
         </w:r>
       </w:hyperlink>
     </w:p>
@@ -366,7 +366,7 @@
           </w:rPr>
           <w:t>6.0 Tracking and Control Mechanisms</w:t>
           <w:tab/>
-          <w:t>9</w:t>
+          <w:t>10</w:t>
         </w:r>
       </w:hyperlink>
     </w:p>
@@ -382,7 +382,7 @@
         <w:r>
           <w:t>6.1 Quality Assurance and Control</w:t>
           <w:tab/>
-          <w:t>9</w:t>
+          <w:t>10</w:t>
         </w:r>
       </w:hyperlink>
     </w:p>
@@ -623,7 +623,31 @@
         <w:pStyle w:val="ListBullet"/>
       </w:pPr>
       <w:r>
-        <w:t xml:space="preserve">Done (Iteration 3): Automated test suite — 74 tests run against a separate local test database</w:t>
+        <w:t xml:space="preserve">Done (Iteration 3): Automated test suite — 95 tests run against a separate local test database</w:t>
+      </w:r>
+    </w:p>
+    <w:p>
+      <w:pPr>
+        <w:pStyle w:val="ListBullet"/>
+      </w:pPr>
+      <w:r>
+        <w:t xml:space="preserve">Done (Iteration 3, Jonah Goodwine): Deployed to AWS Elastic Beanstalk with the RDS database and S3 image storage — live at http://treasurerow.us-east-2.elasticbeanstalk.com; AWS runbook written for access, deploying, troubleshooting, and shutdown (docs/aws-runbook/README.md)</w:t>
+      </w:r>
+    </w:p>
+    <w:p>
+      <w:pPr>
+        <w:pStyle w:val="ListBullet"/>
+      </w:pPr>
+      <w:r>
+        <w:t xml:space="preserve">Done (Iteration 3, Jonah Goodwine): Buyer/seller messaging (messages page and API). This feature was previously removed from scope; it was added back in Iteration 3</w:t>
+      </w:r>
+    </w:p>
+    <w:p>
+      <w:pPr>
+        <w:pStyle w:val="ListBullet"/>
+      </w:pPr>
+      <w:r>
+        <w:t xml:space="preserve">In progress (Iteration 3, Noah Higgs, SCRUM-61): additional security hardening — closing database connections on failed logins, security response headers, rejecting placeholder secret keys, username/password length rules, and unpredictable confirmation numbers; being combined with the already-merged fixes before review</w:t>
       </w:r>
     </w:p>
     <w:p>
@@ -665,7 +689,7 @@
         <w:pStyle w:val="ListBullet"/>
       </w:pPr>
       <w:r>
-        <w:t>The team's original shared AWS RDS instance was unreachable during Iteration 1, so the documented live deployment could not be verified. Status: the team's RDS database is reachable from allow-listed IPs as of Iteration 3; Elastic Beanstalk redeployment is in progress</w:t>
+        <w:t>The team's original shared AWS RDS instance was unreachable during Iteration 1, so the documented live deployment could not be verified. Status: resolved in Iteration 3 — the app is deployed on Elastic Beanstalk (http://treasurerow.us-east-2.elasticbeanstalk.com) and connected to RDS; the database security group allows the Elastic Beanstalk server, each member's IP, and the Hampton campus range (137.198.190.0/24), verified with a live connection on October 27, 2026</w:t>
       </w:r>
     </w:p>
     <w:p>
@@ -876,7 +900,7 @@
     </w:p>
     <w:p>
       <w:r>
-        <w:t>Hosting: AWS Elastic Beanstalk</w:t>
+        <w:t>Hosting: AWS Elastic Beanstalk (single t3.micro instance; gunicorn behind nginx, 25 MB upload limit)</w:t>
       </w:r>
     </w:p>
     <w:p>
@@ -931,7 +955,7 @@
     </w:p>
     <w:p>
       <w:r>
-        <w:t>Cloud: AWS RDS (PostgreSQL), AWS S3, AWS Elastic Beanstalk</w:t>
+        <w:t>Cloud: AWS RDS (PostgreSQL), AWS S3, AWS Elastic Beanstalk — live site http://treasurerow.us-east-2.elasticbeanstalk.com</w:t>
       </w:r>
     </w:p>
     <w:p>
@@ -1044,7 +1068,7 @@
           </w:tcPr>
           <w:p>
             <w:r>
-              <w:t>AWS costs or account status preventing the team from restoring the original cloud deployment. Mitigation: confirm current AWS account status and access, set a spending cap, and restore or provision RDS before full deployment. Owner: Donovan.</w:t>
+              <w:t>AWS costs or account status preventing the team from restoring the original cloud deployment. Status: deployment restored in Iteration 3 (Elastic Beanstalk + RDS + S3, Jonah Goodwine); running on AWS promotional credits. Mitigation: AWS Budgets billing alarm being configured (in progress); shut the environment down between demos per the AWS runbook. Owner: Donovan, Jonah.</w:t>
             </w:r>
           </w:p>
         </w:tc>
@@ -1114,7 +1138,7 @@
           </w:tcPr>
           <w:p>
             <w:r>
-              <w:t>Exposed AWS credentials in version control. Status: redacted in the current repo and loaded from .env; verified in Iteration 3 that the current database password and S3 keys appear nowhere in git history. Any credential that was ever exposed is treated as compromised and rotated. Owner: Jonah, Noah.</w:t>
+              <w:t>Exposed AWS credentials in version control. Status: resolved. The exposed credentials were removed from version control and replaced with new credentials issued by Jonah Goodwine, which are entered only in each member's local .env file and the Elastic Beanstalk environment configuration (Noah Higgs, SCRUM-61); verified in Iteration 3 that the current database password and S3 keys appear nowhere in git history. Owner: Jonah, Noah.</w:t>
             </w:r>
           </w:p>
         </w:tc>
@@ -1275,6 +1299,41 @@
           <w:p>
             <w:r>
               <w:t>Medium/High</w:t>
+            </w:r>
+          </w:p>
+        </w:tc>
+      </w:tr>
+      <w:tr>
+        <w:trPr>
+          <w:jc w:val="center"/>
+        </w:trPr>
+        <w:tc>
+          <w:tcPr>
+            <w:tcW w:w="5184" w:type="dxa"/>
+          </w:tcPr>
+          <w:p>
+            <w:r>
+              <w:t xml:space="preserve">AWS database access blocked for team members (the RDS security group only allows listed IPs, and campus Wi-Fi assigns changing addresses). Status: fixed in Iteration 3 — rules for the Elastic Beanstalk server, each member's IP, and the Hampton campus range 137.198.190.0/24; never open to 0.0.0.0/0. Steps documented in the AWS runbook. Owner: Jonah, Donovan.</w:t>
+            </w:r>
+          </w:p>
+        </w:tc>
+        <w:tc>
+          <w:tcPr>
+            <w:tcW w:w="2160" w:type="dxa"/>
+          </w:tcPr>
+          <w:p>
+            <w:r>
+              <w:t xml:space="preserve">Low (post-fix)</w:t>
+            </w:r>
+          </w:p>
+        </w:tc>
+        <w:tc>
+          <w:tcPr>
+            <w:tcW w:w="1728" w:type="dxa"/>
+          </w:tcPr>
+          <w:p>
+            <w:r>
+              <w:t xml:space="preserve">Medium</w:t>
             </w:r>
           </w:p>
         </w:tc>
@@ -1644,7 +1703,7 @@
               <w:lastRenderedPageBreak/>
               <w:t xml:space="preserve">All current code fixed; full AWS deployment </w:t>
               <w:lastRenderedPageBreak/>
-              <w:t>to Elastic Beanstalk with a live RDS database; a new token-based payment system built and documented; the team's Risk Assessment Plan fixes implemented and that document updated to reflect real status; an AI-assisted polish pass applied to every project document using one team-wide tool, with before/after versions and prompts recorded; minor Functional Spec and Design Spec updates reflecting implementation; meeting minutes, time log, and a status statement on what's working and what isn't. Status: In progress — all current code fixed (74 automated tests passing; awaiting teammate review and merge); front end redesigned; Treasure Tokens payment system built, documented, and tested (95 automated tests passing); Elastic Beanstalk deployment in progress.</w:t>
+              <w:t>to Elastic Beanstalk with a live RDS database; a new token-based payment system built and documented; the team's Risk Assessment Plan fixes implemented and that document updated to reflect real status; an AI-assisted polish pass applied to every project document using one team-wide tool, with before/after versions and prompts recorded; minor Functional Spec and Design Spec updates reflecting implementation; meeting minutes, time log, and a status statement on what's working and what isn't. Status: In progress — all current code fixed and merged (PR #7; 95 automated tests passing); front end redesigned; Treasure Tokens payment system built, documented, and tested; app deployed live on Elastic Beanstalk with RDS and S3 (Jonah Goodwine); buyer/seller messaging added (Jonah Goodwine); RDS security group fixed and verified. Remaining: merge Jonah's PR #8 and Noah's SCRUM-61 security hardening, release develop to main and redeploy from main, and configure the AWS Budgets billing alarm.</w:t>
             </w:r>
           </w:p>
         </w:tc>
@@ -2190,6 +2249,41 @@
           <w:p>
             <w:r>
               <w:t xml:space="preserve">Marked the token-based payment system done: defined the token (Treasure Tokens, held in escrow until an in-person pickup code is confirmed), linked the design document docs/payment-tokens/README.md, and updated the Iteration 3 timeline status.</w:t>
+            </w:r>
+          </w:p>
+        </w:tc>
+      </w:tr>
+      <w:tr>
+        <w:trPr>
+          <w:jc w:val="center"/>
+        </w:trPr>
+        <w:tc>
+          <w:tcPr>
+            <w:tcW w:w="2880" w:type="dxa"/>
+          </w:tcPr>
+          <w:p>
+            <w:r>
+              <w:t xml:space="preserve">3</w:t>
+            </w:r>
+          </w:p>
+        </w:tc>
+        <w:tc>
+          <w:tcPr>
+            <w:tcW w:w="2880" w:type="dxa"/>
+          </w:tcPr>
+          <w:p>
+            <w:r>
+              <w:t xml:space="preserve">October 27, 2026</w:t>
+            </w:r>
+          </w:p>
+        </w:tc>
+        <w:tc>
+          <w:tcPr>
+            <w:tcW w:w="2880" w:type="dxa"/>
+          </w:tcPr>
+          <w:p>
+            <w:r>
+              <w:t xml:space="preserve">Added the rest of the team's Iteration 3 work: Elastic Beanstalk deployment, buyer/seller messaging, and the AWS runbook (Jonah Goodwine); exposed-credentials risk resolved with new credentials, and SCRUM-61 security hardening in progress (Noah Higgs); RDS security group fix with a new access risk row; billing alarm in progress; corrected the test count to 95 and updated the Iteration 3 timeline status.</w:t>
             </w:r>
           </w:p>
         </w:tc>

</xml_diff>

<commit_message>
Project Plan: mark Jonah's, Noah's, and Chi's Iteration 3 PRs as merged
Co-Authored-By: Claude Opus 5.5 <noreply@anthropic.com>
</commit_message>
<xml_diff>
--- a/docs/project-plan/Project_Plan_TreasureRow.docx
+++ b/docs/project-plan/Project_Plan_TreasureRow.docx
@@ -647,7 +647,7 @@
         <w:pStyle w:val="ListBullet"/>
       </w:pPr>
       <w:r>
-        <w:t xml:space="preserve">In progress (Iteration 3, Noah Higgs, SCRUM-61): additional security hardening — closing database connections on failed logins, security response headers, rejecting placeholder secret keys, username/password length rules, and unpredictable confirmation numbers; being combined with the already-merged fixes before review</w:t>
+        <w:t xml:space="preserve">Done (Iteration 3, Noah Higgs, SCRUM-61): additional security hardening — closing database connections on failed logins, security response headers, rejecting placeholder secret keys, username/password length rules, and unpredictable confirmation numbers; merged in PR #11 with all 95 automated tests passing. Noah Higgs also added the team Risk Assessment (docs/risk-assessment)</w:t>
       </w:r>
     </w:p>
     <w:p>
@@ -1703,7 +1703,7 @@
               <w:lastRenderedPageBreak/>
               <w:t xml:space="preserve">All current code fixed; full AWS deployment </w:t>
               <w:lastRenderedPageBreak/>
-              <w:t>to Elastic Beanstalk with a live RDS database; a new token-based payment system built and documented; the team's Risk Assessment Plan fixes implemented and that document updated to reflect real status; an AI-assisted polish pass applied to every project document using one team-wide tool, with before/after versions and prompts recorded; minor Functional Spec and Design Spec updates reflecting implementation; meeting minutes, time log, and a status statement on what's working and what isn't. Status: In progress — all current code fixed and merged (PR #7; 95 automated tests passing); front end redesigned; Treasure Tokens payment system built, documented, and tested; app deployed live on Elastic Beanstalk with RDS and S3 (Jonah Goodwine); buyer/seller messaging added (Jonah Goodwine); RDS security group fixed and verified. Remaining: merge Jonah's PR #8 and Noah's SCRUM-61 security hardening, release develop to main and redeploy from main, and configure the AWS Budgets billing alarm.</w:t>
+              <w:t>to Elastic Beanstalk with a live RDS database; a new token-based payment system built and documented; the team's Risk Assessment Plan fixes implemented and that document updated to reflect real status; an AI-assisted polish pass applied to every project document using one team-wide tool, with before/after versions and prompts recorded; minor Functional Spec and Design Spec updates reflecting implementation; meeting minutes, time log, and a status statement on what's working and what isn't. Status: In progress — all current code fixed and merged (PR #7; 95 automated tests passing); front end redesigned; Treasure Tokens payment system built, documented, and tested; app deployed live on Elastic Beanstalk with RDS and S3 (Jonah Goodwine); buyer/seller messaging added (Jonah Goodwine); RDS security group fixed and verified. Jonah's work (PR #8), Noah's SCRUM-61 hardening and Risk Assessment (PR #11), and Chi's Design Spec before/after (PR #10) merged into develop on October 27, 2026. Remaining: release develop to main and redeploy from main, and configure the AWS Budgets billing alarm.</w:t>
             </w:r>
           </w:p>
         </w:tc>
@@ -2283,7 +2283,7 @@
           </w:tcPr>
           <w:p>
             <w:r>
-              <w:t xml:space="preserve">Added the rest of the team's Iteration 3 work: Elastic Beanstalk deployment, buyer/seller messaging, and the AWS runbook (Jonah Goodwine); exposed-credentials risk resolved with new credentials, and SCRUM-61 security hardening in progress (Noah Higgs); RDS security group fix with a new access risk row; billing alarm in progress; corrected the test count to 95 and updated the Iteration 3 timeline status.</w:t>
+              <w:t xml:space="preserve">Added the rest of the team's Iteration 3 work: Elastic Beanstalk deployment, buyer/seller messaging, and the AWS runbook (Jonah Goodwine); exposed-credentials risk resolved with new credentials, and SCRUM-61 security hardening and the Risk Assessment merged (Noah Higgs); RDS security group fix with a new access risk row; billing alarm in progress; corrected the test count to 95 and updated the Iteration 3 timeline status.</w:t>
             </w:r>
           </w:p>
         </w:tc>

</xml_diff>

<commit_message>
Test Plan and Project Plan: add the rest of the team's Iteration 3 work
Test Plan: TC-42 to TC-51 (SCRUM-61 hardening, messaging, Discover pages,
live deployment); suite table and result updated to 137 passing.
Project Plan: Cameron's Discover pages, the team's AI polish before/after
documents, test count 137, Iteration 3 status and what remains; fixed TOC
page numbers.
New test_security_headers_and_messages.py (22 tests) covers the SCRUM-61
fixes and Jonah's messaging API.

Co-Authored-By: Claude Opus 5.5 <noreply@anthropic.com>
</commit_message>
<xml_diff>
--- a/docs/project-plan/Project_Plan_TreasureRow.docx
+++ b/docs/project-plan/Project_Plan_TreasureRow.docx
@@ -111,7 +111,7 @@
         <w:r>
           <w:t>1.3 Performance/Behavior Issues</w:t>
           <w:tab/>
-          <w:t>3</w:t>
+          <w:t>4</w:t>
         </w:r>
       </w:hyperlink>
     </w:p>
@@ -127,7 +127,7 @@
         <w:r>
           <w:t>1.4 Management and Technical Constraints</w:t>
           <w:tab/>
-          <w:t>4</w:t>
+          <w:t>5</w:t>
         </w:r>
       </w:hyperlink>
     </w:p>
@@ -162,7 +162,7 @@
           </w:rPr>
           <w:t>2.0 Project Estimates</w:t>
           <w:tab/>
-          <w:t>5</w:t>
+          <w:t>6</w:t>
         </w:r>
       </w:hyperlink>
     </w:p>
@@ -178,7 +178,7 @@
         <w:r>
           <w:t>2.1 Historical Data Used for Estimates</w:t>
           <w:tab/>
-          <w:t>5</w:t>
+          <w:t>6</w:t>
         </w:r>
       </w:hyperlink>
     </w:p>
@@ -264,7 +264,7 @@
           </w:rPr>
           <w:t>4.0 Project Schedule</w:t>
           <w:tab/>
-          <w:t>7</w:t>
+          <w:t>8</w:t>
         </w:r>
       </w:hyperlink>
     </w:p>
@@ -280,7 +280,7 @@
         <w:r>
           <w:t>4.1 Project Task Set</w:t>
           <w:tab/>
-          <w:t>7</w:t>
+          <w:t>8</w:t>
         </w:r>
       </w:hyperlink>
     </w:p>
@@ -315,7 +315,7 @@
           </w:rPr>
           <w:t>5.0 Staff Organization</w:t>
           <w:tab/>
-          <w:t>9</w:t>
+          <w:t>10</w:t>
         </w:r>
       </w:hyperlink>
     </w:p>
@@ -331,7 +331,7 @@
         <w:r>
           <w:t>5.1 Team Structure</w:t>
           <w:tab/>
-          <w:t>9</w:t>
+          <w:t>10</w:t>
         </w:r>
       </w:hyperlink>
     </w:p>
@@ -366,7 +366,7 @@
           </w:rPr>
           <w:t>6.0 Tracking and Control Mechanisms</w:t>
           <w:tab/>
-          <w:t>10</w:t>
+          <w:t>11</w:t>
         </w:r>
       </w:hyperlink>
     </w:p>
@@ -382,7 +382,7 @@
         <w:r>
           <w:t>6.1 Quality Assurance and Control</w:t>
           <w:tab/>
-          <w:t>10</w:t>
+          <w:t>11</w:t>
         </w:r>
       </w:hyperlink>
     </w:p>
@@ -401,7 +401,7 @@
           </w:rPr>
           <w:t>7.0 Revision Log</w:t>
           <w:tab/>
-          <w:t>10</w:t>
+          <w:t>11</w:t>
         </w:r>
       </w:hyperlink>
     </w:p>
@@ -623,7 +623,7 @@
         <w:pStyle w:val="ListBullet"/>
       </w:pPr>
       <w:r>
-        <w:t xml:space="preserve">Done (Iteration 3): Automated test suite — 95 tests run against a separate local test database</w:t>
+        <w:t xml:space="preserve">Done (Iteration 3): Automated test suite — 137 tests run against a separate local test database, all passing (Test Plan section 6.0)</w:t>
       </w:r>
     </w:p>
     <w:p>
@@ -648,6 +648,30 @@
       </w:pPr>
       <w:r>
         <w:t xml:space="preserve">Done (Iteration 3, Noah Higgs, SCRUM-61): additional security hardening — closing database connections on failed logins, security response headers, rejecting placeholder secret keys, username/password length rules, and unpredictable confirmation numbers; merged in PR #11 with all 95 automated tests passing. Noah Higgs also added the team Risk Assessment (docs/risk-assessment)</w:t>
+      </w:r>
+    </w:p>
+    <w:p>
+      <w:pPr>
+        <w:pStyle w:val="ListBullet"/>
+      </w:pPr>
+      <w:r>
+        <w:t xml:space="preserve">Done (Iteration 3, Cameron Ridgley): Discover pages — Explore Brands, All Categories, New Drops, and Hot! — with Shop and Sell dropdown menus, a browse listings API (newest or most popular), and 20 automated tests</w:t>
+      </w:r>
+    </w:p>
+    <w:p>
+      <w:pPr>
+        <w:pStyle w:val="ListBullet"/>
+      </w:pPr>
+      <w:r>
+        <w:t xml:space="preserve">Done (Iteration 3): AI-assisted document polish with before/after versions — Project Plan (Donovan Griffin), Design Spec (Chi Martin), Requirements (Chase Jones), Functional Spec with its prompt log (Ricki Davis), and Risk Assessment (Noah Higgs). Test Plan and AWS runbook before/after copies and the remaining prompt logs are in progress</w:t>
+      </w:r>
+    </w:p>
+    <w:p>
+      <w:pPr>
+        <w:pStyle w:val="ListBullet"/>
+      </w:pPr>
+      <w:r>
+        <w:t xml:space="preserve">Done (Iteration 3): Test Plan updated with TC-42 to TC-51 for the SCRUM-61 security hardening, buyer/seller messaging, the Discover pages, and the live deployment</w:t>
       </w:r>
     </w:p>
     <w:p>
@@ -705,7 +729,7 @@
         <w:pStyle w:val="ListBullet"/>
       </w:pPr>
       <w:r>
-        <w:t>Several storefront navigation links (About, All Categories, New Drops, Hot!, Explore Brands, Sitemap) didn't go anywhere. Status: resolved in Iteration 2</w:t>
+        <w:t>Several storefront navigation links (About, All Categories, New Drops, Hot!, Explore Brands, Sitemap) didn't go anywhere. Status: resolved in Iteration 2; in Iteration 3 Cameron Ridgley replaced the placeholder pages with working Discover pages</w:t>
       </w:r>
     </w:p>
     <w:p>
@@ -910,7 +934,7 @@
     </w:p>
     <w:p>
       <w:r>
-        <w:t xml:space="preserve">Testing: pytest — 74 automated tests run against a separate local PostgreSQL test database (backend/tests/conftest.py refuses to run against AWS RDS)</w:t>
+        <w:t xml:space="preserve">Testing: pytest — 137 automated tests run against a separate local PostgreSQL test database (backend/tests/conftest.py refuses to run against AWS RDS)</w:t>
       </w:r>
     </w:p>
     <w:p>
@@ -1703,7 +1727,7 @@
               <w:lastRenderedPageBreak/>
               <w:t xml:space="preserve">All current code fixed; full AWS deployment </w:t>
               <w:lastRenderedPageBreak/>
-              <w:t>to Elastic Beanstalk with a live RDS database; a new token-based payment system built and documented; the team's Risk Assessment Plan fixes implemented and that document updated to reflect real status; an AI-assisted polish pass applied to every project document using one team-wide tool, with before/after versions and prompts recorded; minor Functional Spec and Design Spec updates reflecting implementation; meeting minutes, time log, and a status statement on what's working and what isn't. Status: In progress — all current code fixed and merged (PR #7; 95 automated tests passing); front end redesigned; Treasure Tokens payment system built, documented, and tested; app deployed live on Elastic Beanstalk with RDS and S3 (Jonah Goodwine); buyer/seller messaging added (Jonah Goodwine); RDS security group fixed and verified. Jonah's work (PR #8), Noah's SCRUM-61 hardening and Risk Assessment (PR #11), and Chi's Design Spec before/after (PR #10) merged into develop on October 27, 2026. Remaining: release develop to main and redeploy from main, and configure the AWS Budgets billing alarm.</w:t>
+              <w:t>to Elastic Beanstalk with a live RDS database; a new token-based payment system built and documented; the team's Risk Assessment Plan fixes implemented and that document updated to reflect real status; an AI-assisted polish pass applied to every project document using one team-wide tool, with before/after versions and prompts recorded; minor Functional Spec and Design Spec updates reflecting implementation; meeting minutes, time log, and a status statement on what's working and what isn't. Status: In progress — all current code fixed and merged (PR #7; 95 automated tests passing); front end redesigned; Treasure Tokens payment system built, documented, and tested; app deployed live on Elastic Beanstalk with RDS and S3 (Jonah Goodwine); buyer/seller messaging added (Jonah Goodwine); RDS security group fixed and verified. Jonah's work (PR #8), Noah's SCRUM-61 hardening and Risk Assessment (PR #11), and Chi's Design Spec before/after (PR #10) merged into develop on October 27, 2026. Cameron's Discover pages, Chase's Requirements before/after, Ricki's Functional Spec before/after and prompt log, and Noah's Risk Assessment before/after were pushed for review the same day; with them merged, all 137 automated tests pass. Remaining: merge those pull requests and Jonah's final document edits, release develop to main and redeploy from main, configure the AWS Budgets billing alarm, finish the Test Plan and AWS runbook before/after copies and prompt logs, and update the Functional Spec content for the Iteration 3 features (Treasure Tokens, messaging, Discover pages).</w:t>
             </w:r>
           </w:p>
         </w:tc>
@@ -2284,6 +2308,41 @@
           <w:p>
             <w:r>
               <w:t xml:space="preserve">Added the rest of the team's Iteration 3 work: Elastic Beanstalk deployment, buyer/seller messaging, and the AWS runbook (Jonah Goodwine); exposed-credentials risk resolved with new credentials, and SCRUM-61 security hardening and the Risk Assessment merged (Noah Higgs); RDS security group fix with a new access risk row; billing alarm in progress; corrected the test count to 95 and updated the Iteration 3 timeline status.</w:t>
+            </w:r>
+          </w:p>
+        </w:tc>
+      </w:tr>
+      <w:tr>
+        <w:trPr>
+          <w:jc w:val="center"/>
+        </w:trPr>
+        <w:tc>
+          <w:tcPr>
+            <w:tcW w:w="2880" w:type="dxa"/>
+          </w:tcPr>
+          <w:p>
+            <w:r>
+              <w:t xml:space="preserve">3</w:t>
+            </w:r>
+          </w:p>
+        </w:tc>
+        <w:tc>
+          <w:tcPr>
+            <w:tcW w:w="2880" w:type="dxa"/>
+          </w:tcPr>
+          <w:p>
+            <w:r>
+              <w:t xml:space="preserve">October 27, 2026</w:t>
+            </w:r>
+          </w:p>
+        </w:tc>
+        <w:tc>
+          <w:tcPr>
+            <w:tcW w:w="2880" w:type="dxa"/>
+          </w:tcPr>
+          <w:p>
+            <w:r>
+              <w:t xml:space="preserve">Added Cameron Ridgley's Discover pages, the team's AI polish before/after documents (Chi Martin, Chase Jones, Ricki Davis, Noah Higgs, Donovan Griffin), and the Test Plan's new cases TC-42 to TC-51; updated the test count to 137 and the Iteration 3 timeline status with what remains.</w:t>
             </w:r>
           </w:p>
         </w:tc>

</xml_diff>